<commit_message>
fix(resume): replace inflated AKN metrics with durable scale; update location to Spokane
</commit_message>
<xml_diff>
--- a/docs/assets/downloads/adleta_richard_resume_full.docx
+++ b/docs/assets/downloads/adleta_richard_resume_full.docx
@@ -109,7 +109,7 @@
         </w:numPr>
       </w:pPr>
       <w:r>
-        <w:t xml:space="preserve">Served 6.8M page views annually, with 2.2M-member user base</w:t>
+        <w:t xml:space="preserve">Operated a high-traffic educational platform serving 1M+ annual visitors</w:t>
       </w:r>
     </w:p>
     <w:p>
@@ -153,7 +153,7 @@
         </w:numPr>
       </w:pPr>
       <w:r>
-        <w:t xml:space="preserve">Delivered weekly newsletter to 175K+ subscribers using AWS SES</w:t>
+        <w:t xml:space="preserve">Operated a 1M+ subscriber weekly newsletter system on AWS SES</w:t>
       </w:r>
     </w:p>
     <w:p>

</xml_diff>